<commit_message>
Update booking terms and legal wording
</commit_message>
<xml_diff>
--- a/assets/docs/vop-eventy-jinak.docx
+++ b/assets/docs/vop-eventy-jinak.docx
@@ -9,10 +9,19 @@
       <w:r>
         <w:rPr>
           <w:b/>
-          <w:color w:val="125336"/>
-          <w:sz w:val="44"/>
+          <w:color w:val="267A3F"/>
+          <w:sz w:val="24"/>
         </w:rPr>
-        <w:t>Všeobecné obchodní podmínky</w:t>
+        <w:t>EVENTY JINAK</w:t>
+      </w:r>
+    </w:p>
+    <w:p>
+      <w:pPr>
+        <w:pStyle w:val="Title"/>
+        <w:jc w:val="center"/>
+      </w:pPr>
+      <w:r>
+        <w:t>V?eobecn? obchodn? podm?nky</w:t>
       </w:r>
     </w:p>
     <w:p>
@@ -22,239 +31,29 @@
       <w:r>
         <w:rPr>
           <w:i/>
-          <w:color w:val="505050"/>
-          <w:sz w:val="22"/>
+          <w:color w:val="586258"/>
+          <w:sz w:val="21"/>
         </w:rPr>
-        <w:t>pro zážitkové, sportovní, lezecké a outdoorové akce pořádané pod značkou Eventy Jinak</w:t>
-      </w:r>
-    </w:p>
-    <w:p/>
-    <w:tbl>
-      <w:tblPr>
-        <w:tblStyle w:val="TableGrid"/>
-        <w:tblW w:type="auto" w:w="0"/>
-        <w:jc w:val="center"/>
-        <w:tblLook w:firstColumn="1" w:firstRow="1" w:lastColumn="0" w:lastRow="0" w:noHBand="0" w:noVBand="1" w:val="04A0"/>
-      </w:tblPr>
-      <w:tblGrid>
-        <w:gridCol w:w="4986"/>
-        <w:gridCol w:w="4986"/>
-      </w:tblGrid>
-      <w:tr>
-        <w:tc>
-          <w:tcPr>
-            <w:tcW w:type="dxa" w:w="4986"/>
-            <w:shd w:fill="E8F1EA"/>
-            <w:vAlign w:val="center"/>
-          </w:tcPr>
-          <w:p>
-            <w:r/>
-            <w:r>
-              <w:rPr>
-                <w:b/>
-              </w:rPr>
-              <w:t>Značka / projekt</w:t>
-            </w:r>
-          </w:p>
-        </w:tc>
-        <w:tc>
-          <w:tcPr>
-            <w:tcW w:type="dxa" w:w="4986"/>
-            <w:vAlign w:val="center"/>
-          </w:tcPr>
-          <w:p>
-            <w:r/>
-            <w:r>
-              <w:rPr>
-                <w:b w:val="0"/>
-              </w:rPr>
-              <w:t>Eventy Jinak</w:t>
-            </w:r>
-          </w:p>
-        </w:tc>
-      </w:tr>
-      <w:tr>
-        <w:tc>
-          <w:tcPr>
-            <w:tcW w:type="dxa" w:w="4986"/>
-            <w:shd w:fill="E8F1EA"/>
-            <w:vAlign w:val="center"/>
-          </w:tcPr>
-          <w:p>
-            <w:r/>
-            <w:r>
-              <w:rPr>
-                <w:b/>
-              </w:rPr>
-              <w:t>Provozovatel</w:t>
-            </w:r>
-          </w:p>
-        </w:tc>
-        <w:tc>
-          <w:tcPr>
-            <w:tcW w:type="dxa" w:w="4986"/>
-            <w:vAlign w:val="center"/>
-          </w:tcPr>
-          <w:p>
-            <w:r/>
-            <w:r>
-              <w:rPr>
-                <w:b w:val="0"/>
-              </w:rPr>
-              <w:t>IronBros s.r.o.</w:t>
-            </w:r>
-          </w:p>
-        </w:tc>
-      </w:tr>
-      <w:tr>
-        <w:tc>
-          <w:tcPr>
-            <w:tcW w:type="dxa" w:w="4986"/>
-            <w:shd w:fill="E8F1EA"/>
-            <w:vAlign w:val="center"/>
-          </w:tcPr>
-          <w:p>
-            <w:r/>
-            <w:r>
-              <w:rPr>
-                <w:b/>
-              </w:rPr>
-              <w:t>Sídlo</w:t>
-            </w:r>
-          </w:p>
-        </w:tc>
-        <w:tc>
-          <w:tcPr>
-            <w:tcW w:type="dxa" w:w="4986"/>
-            <w:vAlign w:val="center"/>
-          </w:tcPr>
-          <w:p>
-            <w:r/>
-            <w:r>
-              <w:rPr>
-                <w:b w:val="0"/>
-              </w:rPr>
-              <w:t>č.ev. 402, 267 11 Vráž</w:t>
-            </w:r>
-          </w:p>
-        </w:tc>
-      </w:tr>
-      <w:tr>
-        <w:tc>
-          <w:tcPr>
-            <w:tcW w:type="dxa" w:w="4986"/>
-            <w:shd w:fill="E8F1EA"/>
-            <w:vAlign w:val="center"/>
-          </w:tcPr>
-          <w:p>
-            <w:r/>
-            <w:r>
-              <w:rPr>
-                <w:b/>
-              </w:rPr>
-              <w:t>IČO</w:t>
-            </w:r>
-          </w:p>
-        </w:tc>
-        <w:tc>
-          <w:tcPr>
-            <w:tcW w:type="dxa" w:w="4986"/>
-            <w:vAlign w:val="center"/>
-          </w:tcPr>
-          <w:p>
-            <w:r/>
-            <w:r>
-              <w:rPr>
-                <w:b w:val="0"/>
-              </w:rPr>
-              <w:t>238 94 474</w:t>
-            </w:r>
-          </w:p>
-        </w:tc>
-      </w:tr>
-      <w:tr>
-        <w:tc>
-          <w:tcPr>
-            <w:tcW w:type="dxa" w:w="4986"/>
-            <w:shd w:fill="E8F1EA"/>
-            <w:vAlign w:val="center"/>
-          </w:tcPr>
-          <w:p>
-            <w:r/>
-            <w:r>
-              <w:rPr>
-                <w:b/>
-              </w:rPr>
-              <w:t>Zápis v rejstříku</w:t>
-            </w:r>
-          </w:p>
-        </w:tc>
-        <w:tc>
-          <w:tcPr>
-            <w:tcW w:type="dxa" w:w="4986"/>
-            <w:vAlign w:val="center"/>
-          </w:tcPr>
-          <w:p>
-            <w:r/>
-            <w:r>
-              <w:rPr>
-                <w:b w:val="0"/>
-              </w:rPr>
-              <w:t>spisová značka C 434687 vedená u Městského soudu v Praze; datum vzniku a zápisu: 30. října 2025</w:t>
-            </w:r>
-          </w:p>
-        </w:tc>
-      </w:tr>
-      <w:tr>
-        <w:tc>
-          <w:tcPr>
-            <w:tcW w:type="dxa" w:w="4986"/>
-            <w:shd w:fill="E8F1EA"/>
-            <w:vAlign w:val="center"/>
-          </w:tcPr>
-          <w:p>
-            <w:r/>
-            <w:r>
-              <w:rPr>
-                <w:b/>
-              </w:rPr>
-              <w:t>Kontakt</w:t>
-            </w:r>
-          </w:p>
-        </w:tc>
-        <w:tc>
-          <w:tcPr>
-            <w:tcW w:type="dxa" w:w="4986"/>
-            <w:vAlign w:val="center"/>
-          </w:tcPr>
-          <w:p>
-            <w:r/>
-            <w:r>
-              <w:rPr>
-                <w:b w:val="0"/>
-              </w:rPr>
-              <w:t>[doplnit e-mail] | [doplnit telefon] | [doplnit web]</w:t>
-            </w:r>
-          </w:p>
-        </w:tc>
-      </w:tr>
-    </w:tbl>
-    <w:p/>
-    <w:p>
-      <w:pPr>
-        <w:pStyle w:val="SmallNote"/>
-      </w:pPr>
-      <w:r>
-        <w:rPr>
-          <w:i/>
-        </w:rPr>
-        <w:t>Pracovní vzor dokumentu. Před ostrým nasazením doporučeno doplnit kontakty, web, pojistku, konkrétní storno režim a nechat zkontrolovat advokátem podle přesného modelu objednávek a poskytovaných akcí.</w:t>
+        <w:t>??innost od 30. 4. 2026 | Eventy Jinak | IronBros s.r.o.</w:t>
       </w:r>
     </w:p>
     <w:p/>
     <w:p>
+      <w:pPr>
+        <w:pStyle w:val="Heading1"/>
+      </w:pPr>
       <w:r>
-        <w:t>Účinnost od: [doplnit datum účinnosti]</w:t>
+        <w:t>1. Provozovatel a p?sobnost podm?nek</w:t>
+      </w:r>
+    </w:p>
+    <w:p>
+      <w:r>
+        <w:t>Provozovatelem slu?eb pod zna?kou Eventy Jinak je spole?nost IronBros s.r.o., se s?dlem ?.ev. 402, 267 11 Vr??, I?O 238 94 474, zapsan? pod sp. zn. C 434687 u M?stsk?ho soudu v Praze, kontaktn? e-mail info@eventyjinak.cz.</w:t>
+      </w:r>
+    </w:p>
+    <w:p>
+      <w:r>
+        <w:t>Tyto v?eobecn? obchodn? podm?nky se vztahuj? na objedn?n? a poskytov?n? z??itkov?ch, lezeck?ch, outdoorov?ch, v?kendov?ch a v?cedenn?ch program?, teambuilding?, oslav a souvisej?c?ch slu?eb.</w:t>
       </w:r>
     </w:p>
     <w:p>
@@ -262,22 +61,22 @@
         <w:pStyle w:val="Heading1"/>
       </w:pPr>
       <w:r>
-        <w:t>1. Úvodní ustanovení</w:t>
+        <w:t>2. Popt?vka, nab?dka a vznik smlouvy</w:t>
       </w:r>
     </w:p>
     <w:p>
       <w:r>
-        <w:t>Tyto všeobecné obchodní podmínky upravují práva a povinnosti mezi společností IronBros s.r.o., provozující projekt Eventy Jinak, a zákazníkem při objednání a poskytování zážitkových, sportovních, lezeckých, turistických, animačních a souvisejících služeb.</w:t>
+        <w:t>Odesl?n?m formul??e na webu nebo zasl?n?m e-mailu vznik? nez?vazn? popt?vka, nikoliv automaticky smlouva. Na z?klad? popt?vky p?iprav?me individu?ln? n?vrh akce, kter? obvykle obsahuje druh programu, term?n, lokalitu, po?et ??astn?k?, rozsah slu?eb, cenu, platebn? podm?nky, n?vrh smlouvy a p??padn? z?lohovou fakturu.</w:t>
       </w:r>
     </w:p>
     <w:p>
       <w:r>
-        <w:t>Služby mohou zahrnovat zejména teambuildingy, firemní akce, dětské oslavy, lezení venku ve skalách, seznamovací lezecké programy, víkendové a vícedenní programy s ubytováním, doprovodný program a případně přespání v přírodě nebo pod širákem.</w:t>
+        <w:t>Z?vazn? objedn?vka a uzav?en? smlouvy vznikaj? a? okam?ikem p?ips?n? dohodnut? z?lohov? platby na ??et provozovatele, pokud byl z?kazn?kovi p?edem doru?en n?vrh smlouvy, tyto VOP a z?lohov? faktura.</w:t>
       </w:r>
     </w:p>
     <w:p>
       <w:r>
-        <w:t>Podmínky tvoří součást smlouvy, pokud je na ně odkazováno v nabídce, objednávce, potvrzení objednávky, e-mailové komunikaci nebo objednávkovém formuláři.</w:t>
+        <w:t>Uhrazen?m z?lohy z?kazn?k potvrzuje, ?e se se smlouvou a VOP sezn?mil a souhlas? s nimi.</w:t>
       </w:r>
     </w:p>
     <w:p>
@@ -285,55 +84,17 @@
         <w:pStyle w:val="Heading1"/>
       </w:pPr>
       <w:r>
-        <w:t>2. Vymezení pojmů</w:t>
+        <w:t>3. Cena a platebn? podm?nky</w:t>
       </w:r>
     </w:p>
     <w:p>
-      <w:pPr>
-        <w:pStyle w:val="ListBullet"/>
-      </w:pPr>
       <w:r>
-        <w:t>Provozovatel: IronBros s.r.o., IČO 238 94 474, se sídlem č.ev. 402, 267 11 Vráž, zapsaná pod sp. zn. C 434687 u Městského soudu v Praze, provozující projekt Eventy Jinak.</w:t>
+        <w:t>Cena je stanovena individu?ln? podle po?tu ??astn?k?, rozsahu programu, lokality, n?rok? na instruktory, dopravu, vybaven?, ubytov?n?, stravu, fotodokumentaci a dal??ch sjednan?ch slu?eb.</w:t>
       </w:r>
     </w:p>
     <w:p>
-      <w:pPr>
-        <w:pStyle w:val="ListBullet"/>
-      </w:pPr>
       <w:r>
-        <w:t>Zákazník: osoba nebo společnost, která poptá nebo objedná službu. Zákazník může být spotřebitel, podnikatel nebo právnická osoba.</w:t>
-      </w:r>
-    </w:p>
-    <w:p>
-      <w:pPr>
-        <w:pStyle w:val="ListBullet"/>
-      </w:pPr>
-      <w:r>
-        <w:t>Účastník: fyzická osoba, která se akce fakticky účastní. Účastníkem může být i nezletilá osoba.</w:t>
-      </w:r>
-    </w:p>
-    <w:p>
-      <w:pPr>
-        <w:pStyle w:val="ListBullet"/>
-      </w:pPr>
-      <w:r>
-        <w:t>Akce: konkrétní program, event, teambuilding, oslava, lezení, kurz, výlet, víkendový nebo vícedenní program organizovaný provozovatelem.</w:t>
-      </w:r>
-    </w:p>
-    <w:p>
-      <w:pPr>
-        <w:pStyle w:val="ListBullet"/>
-      </w:pPr>
-      <w:r>
-        <w:t>Instruktor / průvodce / animátor: osoba pověřená provozovatelem, zpravidla externí OSVČ, která na místě vede nebo zajišťuje program, instruuje účastníky a dohlíží na průběh akce.</w:t>
-      </w:r>
-    </w:p>
-    <w:p>
-      <w:pPr>
-        <w:pStyle w:val="ListBullet"/>
-      </w:pPr>
-      <w:r>
-        <w:t>Objednávka: závazné potvrzení nabídky zákazníkem, případně odeslání závazného objednávkového formuláře.</w:t>
+        <w:t>Pokud nen? dohodnuto jinak, po?adujeme p?ed realizac? akce z?lohu, zpravidla ve v??i 50 % z celkov? ceny. Term?n akce pova?ujeme za z?vazn? rezervovan? a? po p?ips?n? z?lohy. Doplatek ceny je splatn? podle individu?ln? nab?dky, smlouvy nebo vystaven? faktury.</w:t>
       </w:r>
     </w:p>
     <w:p>
@@ -341,39 +102,17 @@
         <w:pStyle w:val="Heading1"/>
       </w:pPr>
       <w:r>
-        <w:t>3. Vznik smlouvy a objednání služby</w:t>
+        <w:t>4. Zm?na programu, po?as? a bezpe?nost</w:t>
       </w:r>
     </w:p>
     <w:p>
-      <w:pPr>
-        <w:pStyle w:val="ListNumber"/>
-      </w:pPr>
       <w:r>
-        <w:t>Zákazník poptá službu prostřednictvím webového formuláře, e-mailu, telefonu, sociálních sítí nebo jiným dohodnutým způsobem.</w:t>
+        <w:t>Outdoorov? a lezeck? akce jsou z?visl? na po?as?, stavu ter?nu, pravidlech dan? lokality, ochran? p??rody a aktu?ln? bezpe?nostn? situaci. Z t?chto d?vod? jsme opr?vn?ni p?im??en? zm?nit lokalitu, trasu, ?asov? harmonogram nebo obsah programu.</w:t>
       </w:r>
     </w:p>
     <w:p>
-      <w:pPr>
-        <w:pStyle w:val="ListNumber"/>
-      </w:pPr>
       <w:r>
-        <w:t>Na základě poptávky provozovatel připraví individuální nabídku. Nabídka zpravidla obsahuje druh programu, termín, orientační nebo konečnou cenu, počet účastníků, zahrnuté služby, místo konání a platební podmínky.</w:t>
-      </w:r>
-    </w:p>
-    <w:p>
-      <w:pPr>
-        <w:pStyle w:val="ListNumber"/>
-      </w:pPr>
-      <w:r>
-        <w:t>Smlouva je uzavřena okamžikem, kdy zákazník nabídku výslovně přijme, potvrdí objednávku, zaplatí zálohu, nebo jinak zjevně projeví souhlas s realizací akce.</w:t>
-      </w:r>
-    </w:p>
-    <w:p>
-      <w:pPr>
-        <w:pStyle w:val="ListNumber"/>
-      </w:pPr>
-      <w:r>
-        <w:t>Provozovatel je oprávněn odmítnout poptávku, zejména pokud není možné zajistit bezpečný průběh akce, vhodného instruktora, kapacitu, lokalitu, vybavení nebo pokud by akce odporovala právním předpisům či bezpečnostním pravidlům.</w:t>
+        <w:t>Pokud nen? mo?n? akci bezpe?n? realizovat, budeme p?ednostn? hledat n?hradn? term?n nebo bezpe?nou alternativu programu.</w:t>
       </w:r>
     </w:p>
     <w:p>
@@ -381,47 +120,66 @@
         <w:pStyle w:val="Heading1"/>
       </w:pPr>
       <w:r>
-        <w:t>4. Cena, záloha a platební podmínky</w:t>
+        <w:t>5. Storno a zm?na term?nu</w:t>
+      </w:r>
+    </w:p>
+    <w:p>
+      <w:r>
+        <w:t>Po uzav?en? smlouvy a uhrazen? z?lohy se p??padn? zru?en? akce nebo odstoupen? z?kazn?ka ??d? t?mito storno podm?nkami, pokud nen? v individu?ln? nab?dce nebo smlouv? sjedn?no jinak:</w:t>
       </w:r>
     </w:p>
     <w:p>
       <w:pPr>
-        <w:pStyle w:val="ListNumber"/>
+        <w:pStyle w:val="ListBullet"/>
+        <w:spacing w:after="40"/>
       </w:pPr>
       <w:r>
-        <w:t>Cena je stanovena individuálně podle rozsahu programu, počtu účastníků, lokality, nároků na instruktory, dopravu, vybavení, ubytování, stravu, dokumentaci a doprovodný program.</w:t>
+        <w:t>v?ce ne? 30 dn? p?ed akc?: do 20 % ceny,</w:t>
       </w:r>
     </w:p>
     <w:p>
       <w:pPr>
-        <w:pStyle w:val="ListNumber"/>
+        <w:pStyle w:val="ListBullet"/>
+        <w:spacing w:after="40"/>
       </w:pPr>
       <w:r>
-        <w:t>Není-li sjednáno jinak, je zákazník povinen uhradit zálohu ve výši uvedené v nabídce. Termín je rezervován až po potvrzení objednávky a případně po připsání zálohy, pokud byla vyžadována.</w:t>
+        <w:t>15 a? 30 dn? p?ed akc?: do 50 % ceny,</w:t>
       </w:r>
     </w:p>
     <w:p>
       <w:pPr>
-        <w:pStyle w:val="ListNumber"/>
+        <w:pStyle w:val="ListBullet"/>
+        <w:spacing w:after="40"/>
       </w:pPr>
       <w:r>
-        <w:t>Doplatek ceny je splatný před akcí, v den akce nebo po akci podle dohody v nabídce. U firemních zákazníků může být doplatek fakturován po skončení akce.</w:t>
+        <w:t>7 a? 14 dn? p?ed akc?: do 75 % ceny,</w:t>
       </w:r>
     </w:p>
     <w:p>
       <w:pPr>
-        <w:pStyle w:val="ListNumber"/>
+        <w:pStyle w:val="ListBullet"/>
+        <w:spacing w:after="40"/>
       </w:pPr>
       <w:r>
-        <w:t>Pokud zákazník neuhradí zálohu nebo doplatek včas, je provozovatel oprávněn pozastavit přípravu akce, termín uvolnit nebo od smlouvy odstoupit.</w:t>
+        <w:t>m?n? ne? 7 dn? p?ed akc?: do 100 % ceny.</w:t>
       </w:r>
     </w:p>
     <w:p>
       <w:pPr>
-        <w:pStyle w:val="ListNumber"/>
+        <w:pStyle w:val="ListBullet"/>
+        <w:spacing w:after="40"/>
       </w:pPr>
       <w:r>
-        <w:t>Ceny nezahrnují služby třetích osob, které nejsou výslovně uvedeny v nabídce, například dopravu účastníků, parkovné, vstupy, ubytování, stravu, pojištění účastníků nebo pronájem prostor.</w:t>
+        <w:t>Konkr?tn? v??e storna se v?dy posuzuje i podle ji? vznikl?ch a nevratn?ch n?klad?, zejm?na u dopravy, ubytov?n?, pr?ce instruktor? nebo dal??ch slu?eb t?et?ch osob.</w:t>
+      </w:r>
+    </w:p>
+    <w:p>
+      <w:pPr>
+        <w:pStyle w:val="ListBullet"/>
+        <w:spacing w:after="40"/>
+      </w:pPr>
+      <w:r>
+        <w:t>Uhrazen?m z?lohy z?kazn?k bere na v?dom?, ?e po vzniku z?vazn? objedn?vky se p??padn? ukon?en? vztahu ??d? storno podm?nkami, nikoliv pouh?m bezplatn?m zru?en?m rezervace.</w:t>
       </w:r>
     </w:p>
     <w:p>
@@ -429,47 +187,22 @@
         <w:pStyle w:val="Heading1"/>
       </w:pPr>
       <w:r>
-        <w:t>5. Storno, změny termínu a počasí</w:t>
+        <w:t>6. Spot?ebitel a odstoupen? od smlouvy</w:t>
       </w:r>
     </w:p>
     <w:p>
-      <w:pPr>
-        <w:pStyle w:val="ListNumber"/>
-      </w:pPr>
       <w:r>
-        <w:t>Outdoorové a lezecké akce jsou závislé na počasí, stavu terénu, bezpečnostní situaci, dostupnosti lokalit a rozhodnutí instruktora na místě.</w:t>
+        <w:t>Je-li z?kazn?kem spot?ebitel a smlouva je uzav?ena distan?n?, uplatn? se p??slu?n? pravidla ochrany spot?ebitele.</w:t>
       </w:r>
     </w:p>
     <w:p>
-      <w:pPr>
-        <w:pStyle w:val="ListNumber"/>
-      </w:pPr>
       <w:r>
-        <w:t>Provozovatel je oprávněn změnit program, trasu, lokalitu, časový harmonogram nebo náplň akce, pokud je to potřebné z důvodu bezpečnosti, počasí, stavu skal, uzavírek, ochrany přírody, dopravní situace nebo jiných okolností.</w:t>
+        <w:t>U slu?eb souvisej?c?ch s volno?asov?mi aktivitami poskytovan?mi v konkr?tn?m term?nu nebo obdob? m??e b?t pr?vo odstoupit od smlouvy bez ud?n? d?vodu vylou?eno v rozsahu stanoven?m pr?vn?mi p?edpisy.</w:t>
       </w:r>
     </w:p>
     <w:p>
-      <w:pPr>
-        <w:pStyle w:val="ListNumber"/>
-      </w:pPr>
       <w:r>
-        <w:t>Není-li v individuální nabídce sjednáno jinak, doporučený storno režim je: zrušení více než 30 dní před akcí - storno náklady do 20 % ceny; 15 až 30 dní - do 50 % ceny; 7 až 14 dní - do 75 % ceny; méně než 7 dní - do 100 % ceny. Konkrétní výše se vždy posuzuje podle již vzniklých nákladů a sjednaných služeb třetích osob.</w:t>
-      </w:r>
-    </w:p>
-    <w:p>
-      <w:pPr>
-        <w:pStyle w:val="ListNumber"/>
-      </w:pPr>
-      <w:r>
-        <w:t>Pokud je nutné akci přesunout z bezpečnostních důvodů nebo kvůli počasí, strany se přednostně dohodnou na náhradním termínu nebo náhradním programu. Již vzniklé náklady třetích osob, které nelze stornovat, mohou být zákazníkovi účtovány.</w:t>
-      </w:r>
-    </w:p>
-    <w:p>
-      <w:pPr>
-        <w:pStyle w:val="ListNumber"/>
-      </w:pPr>
-      <w:r>
-        <w:t>U vícedenních akcí, ubytování, dopravy a služeb třetích osob se použijí také storno podmínky příslušného poskytovatele, pokud byly zákazníkovi předem sděleny.</w:t>
+        <w:t>Web Eventy Jinak slou?? p?edev??m pro nez?vazn? popt?vky. Samotn? smlouva a z?vazn? rezervace term?nu vznikaj? a? po doru?en? n?vrhu smlouvy a p?ips?n? z?lohov? platby.</w:t>
       </w:r>
     </w:p>
     <w:p>
@@ -477,39 +210,48 @@
         <w:pStyle w:val="Heading1"/>
       </w:pPr>
       <w:r>
-        <w:t>6. Spotřebitel, distanční smlouvy a odstoupení</w:t>
+        <w:t>7. Povinnosti z?kazn?ka a ??astn?k?</w:t>
+      </w:r>
+    </w:p>
+    <w:p>
+      <w:r>
+        <w:t>uv?st pravdiv? informace o po?tu ??astn?k?, v?ku, zku?enostech a zdravotn?ch omezen?ch,</w:t>
       </w:r>
     </w:p>
     <w:p>
       <w:pPr>
-        <w:pStyle w:val="ListNumber"/>
+        <w:pStyle w:val="ListBullet"/>
+        <w:spacing w:after="40"/>
       </w:pPr>
       <w:r>
-        <w:t>Je-li zákazníkem spotřebitel a smlouva je uzavřena distančně, platí pro něj příslušná ochrana spotřebitele podle právních předpisů.</w:t>
+        <w:t>zajistit, aby byli ??astn?ci sezn?meni s charakterem programu a bezpe?nostn?mi pravidly,</w:t>
       </w:r>
     </w:p>
     <w:p>
       <w:pPr>
-        <w:pStyle w:val="ListNumber"/>
+        <w:pStyle w:val="ListBullet"/>
+        <w:spacing w:after="40"/>
       </w:pPr>
       <w:r>
-        <w:t>Pokud je služba volnočasovou službou poskytovanou v konkrétním termínu nebo období, může být právo spotřebitele odstoupit od smlouvy bez udání důvodu omezeno nebo vyloučeno v rozsahu povoleném zákonem. Zákazník na to musí být upozorněn před uzavřením smlouvy.</w:t>
+        <w:t>dodr?ovat pokyny instruktora, pr?vodce nebo jin? pov??en? osoby,</w:t>
       </w:r>
     </w:p>
     <w:p>
       <w:pPr>
-        <w:pStyle w:val="ListNumber"/>
+        <w:pStyle w:val="ListBullet"/>
+        <w:spacing w:after="40"/>
       </w:pPr>
       <w:r>
-        <w:t>Pokud zákazník požádá o zahájení příprav nebo poskytování služby před uplynutím lhůty pro odstoupení, bere na vědomí, že v případě odstoupení může být povinen uhradit poměrnou část ceny za již poskytnuté plnění a skutečně vzniklé náklady.</w:t>
+        <w:t>ne??astnit se programu pod vlivem alkoholu nebo jin?ch n?vykov?ch l?tek,</w:t>
       </w:r>
     </w:p>
     <w:p>
       <w:pPr>
-        <w:pStyle w:val="ListNumber"/>
+        <w:pStyle w:val="ListBullet"/>
+        <w:spacing w:after="40"/>
       </w:pPr>
       <w:r>
-        <w:t>Tento článek nenahrazuje individuální poučení spotřebitele. Provozovatel doporučuje mít na webu samostatné poučení o odstoupení a reklamacích.</w:t>
+        <w:t>m?t vhodn? oble?en?, obuv a vybaven? odpov?daj?c? pokyn?m organiz?tora.</w:t>
       </w:r>
     </w:p>
     <w:p>
@@ -517,55 +259,17 @@
         <w:pStyle w:val="Heading1"/>
       </w:pPr>
       <w:r>
-        <w:t>7. Povinnosti zákazníka a účastníků</w:t>
+        <w:t>8. Rizikovost programu</w:t>
       </w:r>
     </w:p>
     <w:p>
-      <w:pPr>
-        <w:pStyle w:val="ListNumber"/>
-      </w:pPr>
       <w:r>
-        <w:t>Zákazník je povinen předem pravdivě sdělit počet účastníků, věk účastníků, zkušenosti, zdravotní omezení, alergie, zvláštní potřeby, požadavky na program a kontaktní osobu na místě.</w:t>
+        <w:t>Z?kazn?k i ??astn?ci berou na v?dom?, ?e lezen? ve skal?ch, pohyb v p??rod?, sla?ov?n?, v?cedenn? programy a dal?? outdoorov? aktivity jsou spojeny s p?irozen?m rizikem, kter? nelze zcela odstranit ani p?i odborn?m veden? a pou?it? bezpe?nostn?ho vybaven?.</w:t>
       </w:r>
     </w:p>
     <w:p>
-      <w:pPr>
-        <w:pStyle w:val="ListNumber"/>
-      </w:pPr>
       <w:r>
-        <w:t>Zákazník zajistí, aby se s těmito podmínkami, bezpečnostními pravidly a pokyny seznámili všichni účastníci, případně zákonní zástupci nezletilých účastníků.</w:t>
-      </w:r>
-    </w:p>
-    <w:p>
-      <w:pPr>
-        <w:pStyle w:val="ListNumber"/>
-      </w:pPr>
-      <w:r>
-        <w:t>Účastníci jsou povinni řídit se pokyny instruktora, průvodce, animátora nebo jiné pověřené osoby. Nedodržení pokynů může vést k vyloučení účastníka z programu bez nároku na vrácení ceny.</w:t>
-      </w:r>
-    </w:p>
-    <w:p>
-      <w:pPr>
-        <w:pStyle w:val="ListNumber"/>
-      </w:pPr>
-      <w:r>
-        <w:t>Účastník se nesmí účastnit akce pod vlivem alkoholu, omamných nebo psychotropních látek, při vážné únavě, nemoci nebo zdravotním stavu neslučitelném s programem.</w:t>
-      </w:r>
-    </w:p>
-    <w:p>
-      <w:pPr>
-        <w:pStyle w:val="ListNumber"/>
-      </w:pPr>
-      <w:r>
-        <w:t>Účastník je povinen používat vybavení podle pokynů, nezasahovat do lanových a jistících systémů bez souhlasu instruktora, nevzdalovat se od skupiny a neprovádět činnosti mimo dohodnutý program.</w:t>
-      </w:r>
-    </w:p>
-    <w:p>
-      <w:pPr>
-        <w:pStyle w:val="ListNumber"/>
-      </w:pPr>
-      <w:r>
-        <w:t>Zákazník odpovídá za škodu způsobenou úmyslně nebo z nedbalosti jím, jeho účastníky, zaměstnanci, dětmi nebo osobami, které do akce přihlásil.</w:t>
+        <w:t>Program p?izp?sobujeme zku?enostem skupiny, ale ??astn?ci jsou povinni aktivn? spolupracovat a bez odkladu hl?sit zdravotn? omezen?, ?navu nebo jin? okolnosti podstatn? pro bezpe?nost.</w:t>
       </w:r>
     </w:p>
     <w:p>
@@ -573,39 +277,12 @@
         <w:pStyle w:val="Heading1"/>
       </w:pPr>
       <w:r>
-        <w:t>8. Rizikovost lezení a venkovních aktivit</w:t>
+        <w:t>9. Nezletil? ??astn?ci</w:t>
       </w:r>
     </w:p>
     <w:p>
-      <w:pPr>
-        <w:pStyle w:val="ListNumber"/>
-      </w:pPr>
       <w:r>
-        <w:t>Zákazník bere na vědomí, že lezení ve skalách, pobyt v přírodě, pohyb v nerovném terénu, slaňování, jištění, turistika, vícedenní programy a přespávání venku jsou činnosti spojené s přirozeným rizikem.</w:t>
-      </w:r>
-    </w:p>
-    <w:p>
-      <w:pPr>
-        <w:pStyle w:val="ListNumber"/>
-      </w:pPr>
-      <w:r>
-        <w:t>Rizika mohou zahrnovat zejména pád, uklouznutí, zakopnutí, padající kameny nebo větve, změnu počasí, chlad, horko, únavu, bodnutí hmyzem, alergickou reakci, poranění při manipulaci s vybavením, chybu účastníka nebo jiného účastníka a rizika spojená s dopravou nebo pohybem ve veřejném prostoru.</w:t>
-      </w:r>
-    </w:p>
-    <w:p>
-      <w:pPr>
-        <w:pStyle w:val="ListNumber"/>
-      </w:pPr>
-      <w:r>
-        <w:t>Provozovatel přijímá přiměřená bezpečnostní opatření, volí vhodný program podle skupiny a využívá instruktory nebo průvodce. Přirozená rizika outdoorových a lezeckých aktivit však nelze zcela odstranit.</w:t>
-      </w:r>
-    </w:p>
-    <w:p>
-      <w:pPr>
-        <w:pStyle w:val="ListNumber"/>
-      </w:pPr>
-      <w:r>
-        <w:t>Účast na akci je dobrovolná. Účastník je povinen zvážit vlastní fyzický a psychický stav a kdykoli oznámit instruktorovi, že se necítí schopen pokračovat.</w:t>
+        <w:t>??ast nezletil?ch je mo?n? pouze se souhlasem z?konn?ho z?stupce. Z?kazn?k je povinen p?edat v?echny podstatn? informace o d?t?ti, zejm?na v?k, zdravotn? omezen?, alergie, kontakty pro p??pad nouze a osobu odpov?dnou za p?ed?n? a p?evzet? d?t?te.</w:t>
       </w:r>
     </w:p>
     <w:p>
@@ -613,39 +290,12 @@
         <w:pStyle w:val="Heading1"/>
       </w:pPr>
       <w:r>
-        <w:t>9. Nezletilí účastníci</w:t>
+        <w:t>10. Extern? instrukto?i a dal?? dodavatel?</w:t>
       </w:r>
     </w:p>
     <w:p>
-      <w:pPr>
-        <w:pStyle w:val="ListNumber"/>
-      </w:pPr>
       <w:r>
-        <w:t>Účast nezletilých osob je možná pouze se souhlasem zákonného zástupce a za podmínek uvedených v nabídce, bezpečnostních pravidlech a souhlasovém formuláři.</w:t>
-      </w:r>
-    </w:p>
-    <w:p>
-      <w:pPr>
-        <w:pStyle w:val="ListNumber"/>
-      </w:pPr>
-      <w:r>
-        <w:t>Zákonný zástupce je povinen pravdivě uvést věk dítěte, zdravotní omezení, alergie, specifické potřeby, kontakty pro případ nouze a informaci, kdo dítě předává a přebírá.</w:t>
-      </w:r>
-    </w:p>
-    <w:p>
-      <w:pPr>
-        <w:pStyle w:val="ListNumber"/>
-      </w:pPr>
-      <w:r>
-        <w:t>U dětských oslav a programů provozovatel určí počet instruktorů a doprovodu podle věku, počtu dětí, charakteru programu, lokality a rizikovosti. Pokud zákazník požaduje program s dětmi, je povinen respektovat minimální počet dospělých osob a bezpečnostní poměr stanovený provozovatelem.</w:t>
-      </w:r>
-    </w:p>
-    <w:p>
-      <w:pPr>
-        <w:pStyle w:val="ListNumber"/>
-      </w:pPr>
-      <w:r>
-        <w:t>Zákonný zástupce bere na vědomí, že souhlas s účastí dítěte nenahrazuje odpovědnost za pravdivé informace o dítěti a za předání dítěte ve stavu způsobilém k účasti.</w:t>
+        <w:t>Akce mohou b?t zaji??ov?ny tak? prost?ednictv?m extern?ch instruktor?, pr?vodc?, fotograf?, dopravc?, ubytovac?ch za??zen? a dal??ch spolupracuj?c?ch osob. ??astn?ci jsou povinni ??dit se jejich pokyny v rozsahu, v jak?m jsou pov??eni organizac? a bezpe?n?m veden?m akce.</w:t>
       </w:r>
     </w:p>
     <w:p>
@@ -653,39 +303,17 @@
         <w:pStyle w:val="Heading1"/>
       </w:pPr>
       <w:r>
-        <w:t>10. Externí instruktoři, průvodci a animátoři</w:t>
+        <w:t>11. Odpov?dnost a poji?t?n?</w:t>
       </w:r>
     </w:p>
     <w:p>
-      <w:pPr>
-        <w:pStyle w:val="ListNumber"/>
-      </w:pPr>
       <w:r>
-        <w:t>Provozovatel je oprávněn zajistit realizaci akce prostřednictvím externích spolupracovníků, zejména instruktorů lezení, průvodců, animátorů, fotografů, zdravotníků, dopravců nebo poskytovatelů ubytování.</w:t>
+        <w:t>Odpov?d?me za ??dn? poskytnut? sjednan? slu?by v rozsahu podle pr?vn?ch p?edpis? a individu?ln? nab?dky. Neodpov?d?me v?ak za ?kodu nebo ?jmu zp?sobenou zejm?na poru?en?m pokyn?, zatajen?m d?le?it?ch informac?, nevhodn?m vybaven?m, jedn?n?m ??astn?ka, jedn?n?m t?et?ch osob nebo vy??? moc?.</w:t>
       </w:r>
     </w:p>
     <w:p>
-      <w:pPr>
-        <w:pStyle w:val="ListNumber"/>
-      </w:pPr>
       <w:r>
-        <w:t>Externí spolupracovník může být samostatnou podnikající osobou. Pro účastníka je však v průběhu akce pověřenou osobou provozovatele a účastníci jsou povinni řídit se jeho pokyny.</w:t>
-      </w:r>
-    </w:p>
-    <w:p>
-      <w:pPr>
-        <w:pStyle w:val="ListNumber"/>
-      </w:pPr>
-      <w:r>
-        <w:t>Provozovatel vybírá spolupracovníky podle charakteru akce, požadované kvalifikace, zkušeností a dostupnosti. Zákazník bere na vědomí, že konkrétní osoba instruktora může být změněna, pokud bude zachována přiměřená úroveň služby.</w:t>
-      </w:r>
-    </w:p>
-    <w:p>
-      <w:pPr>
-        <w:pStyle w:val="ListNumber"/>
-      </w:pPr>
-      <w:r>
-        <w:t>Externí poskytovatelé ubytování, dopravy, stravování nebo jiných služeb odpovídají za své služby podle vlastních podmínek a právních předpisů, pokud jsou tyto služby poskytovány jejich jménem.</w:t>
+        <w:t>Poji?t?n? provozovatele nen? automaticky ?razov?m poji?t?n?m ??astn?k?. U v?cedenn?ch a rizikov?j??ch program? doporu?ujeme vlastn? ?razov? nebo cestovn? poji?t?n?.</w:t>
       </w:r>
     </w:p>
     <w:p>
@@ -693,39 +321,17 @@
         <w:pStyle w:val="Heading1"/>
       </w:pPr>
       <w:r>
-        <w:t>11. Odpovědnost a pojištění</w:t>
+        <w:t>12. Reklamace a ?e?en? spor?</w:t>
       </w:r>
     </w:p>
     <w:p>
-      <w:pPr>
-        <w:pStyle w:val="ListNumber"/>
-      </w:pPr>
       <w:r>
-        <w:t>Provozovatel odpovídá zákazníkovi v rozsahu stanoveném právními předpisy a smlouvou. Nic v těchto podmínkách nemá za cíl vyloučit nebo omezit odpovědnost za újmu v rozsahu, v jakém to zákon nepřipouští.</w:t>
+        <w:t>Vady slu?by je vhodn? vytknout bez zbyte?n?ho odkladu, ide?ln? ji? v pr?b?hu akce, aby bylo mo?n? situaci ?e?it na m?st?. P?semn? reklamace lze zaslat na info@eventyjinak.cz.</w:t>
       </w:r>
     </w:p>
     <w:p>
-      <w:pPr>
-        <w:pStyle w:val="ListNumber"/>
-      </w:pPr>
       <w:r>
-        <w:t>Provozovatel neodpovídá za újmu nebo škodu způsobenou porušením pokynů, vědomým riskováním, zatajením zdravotního stavu, nevhodnou obuví nebo oblečením, svévolným vzdálením se od skupiny, manipulací s vybavením bez pokynu, jednáním třetích osob nebo vyšší mocí.</w:t>
-      </w:r>
-    </w:p>
-    <w:p>
-      <w:pPr>
-        <w:pStyle w:val="ListNumber"/>
-      </w:pPr>
-      <w:r>
-        <w:t>Provozovatel neodpovídá za osobní věci účastníků, pokud je výslovně nepřevzal do úschovy.</w:t>
-      </w:r>
-    </w:p>
-    <w:p>
-      <w:pPr>
-        <w:pStyle w:val="ListNumber"/>
-      </w:pPr>
-      <w:r>
-        <w:t>Provozovatel bude mít sjednané pojištění odpovědnosti v rozsahu odpovídajícím povaze poskytovaných služeb. Pojištění provozovatele není úrazovým pojištěním účastníků. Zákazníkům se doporučuje vlastní úrazové, cestovní nebo odpovědnostní pojištění, zejména u vícedenních a rizikovějších programů.</w:t>
+        <w:t>Spot?ebitel m? pr?vo obr?tit se se st??nost? tak? na subjekt mimosoudn?ho ?e?en? spot?ebitelsk?ch spor?. Podrobnosti uv?d?me v dokumentu Reklamace a ADR.</w:t>
       </w:r>
     </w:p>
     <w:p>
@@ -733,211 +339,22 @@
         <w:pStyle w:val="Heading1"/>
       </w:pPr>
       <w:r>
-        <w:t>12. Vybavení, oblečení a vlastní materiál účastníků</w:t>
+        <w:t>13. Z?v?re?n? ustanoven?</w:t>
       </w:r>
     </w:p>
     <w:p>
-      <w:pPr>
-        <w:pStyle w:val="ListNumber"/>
-      </w:pPr>
       <w:r>
-        <w:t>Provozovatel nebo instruktor zajistí vybavení v rozsahu uvedeném v nabídce. Účastník je povinen vybavení používat pouze podle pokynů.</w:t>
-      </w:r>
-    </w:p>
-    <w:p>
-      <w:pPr>
-        <w:pStyle w:val="ListNumber"/>
-      </w:pPr>
-      <w:r>
-        <w:t>Zákazník zajistí, aby účastníci měli vhodnou obuv, oblečení do přírody, náhradní vrstvy, ochranu před sluncem, vodu, jídlo a další osobní výbavu podle instrukcí provozovatele.</w:t>
-      </w:r>
-    </w:p>
-    <w:p>
-      <w:pPr>
-        <w:pStyle w:val="ListNumber"/>
-      </w:pPr>
-      <w:r>
-        <w:t>Použití vlastního lezeckého vybavení účastníka je možné pouze se souhlasem instruktora. Instruktor může odmítnout použití vybavení, jehož stav nebo vhodnost není možné ověřit.</w:t>
-      </w:r>
-    </w:p>
-    <w:p>
-      <w:pPr>
-        <w:pStyle w:val="Heading1"/>
-      </w:pPr>
-      <w:r>
-        <w:t>13. Fotografie, video a propagace</w:t>
-      </w:r>
-    </w:p>
-    <w:p>
-      <w:pPr>
-        <w:pStyle w:val="ListNumber"/>
-      </w:pPr>
-      <w:r>
-        <w:t>V rámci akce mohou být pořizovány fotografie nebo videozáznamy pro dokumentaci průběhu akce, předání zákazníkovi nebo marketingové účely. Konkrétní režim musí být řešen samostatným souhlasovým formulářem nebo dohodou se zákazníkem.</w:t>
-      </w:r>
-    </w:p>
-    <w:p>
-      <w:pPr>
-        <w:pStyle w:val="ListNumber"/>
-      </w:pPr>
-      <w:r>
-        <w:t>Marketingové použití rozpoznatelných podobizen účastníků, zejména dětí, musí být založeno na samostatném, dobrovolném a odvolatelném svolení / souhlasu. Neposkytnutí souhlasu nesmí být důvodem k neposkytnutí objednané služby.</w:t>
-      </w:r>
-    </w:p>
-    <w:p>
-      <w:pPr>
-        <w:pStyle w:val="ListNumber"/>
-      </w:pPr>
-      <w:r>
-        <w:t>Zákazník je povinen zajistit, aby případné souhlasy za nezletilé účastníky udělil jejich zákonný zástupce. Provozovatel může odmítnout zveřejnit fotografie nebo videa, pokud není souhlas řádně doložen.</w:t>
-      </w:r>
-    </w:p>
-    <w:p>
-      <w:pPr>
-        <w:pStyle w:val="Heading1"/>
-      </w:pPr>
-      <w:r>
-        <w:t>14. Ochrana osobních údajů</w:t>
-      </w:r>
-    </w:p>
-    <w:p>
-      <w:pPr>
-        <w:pStyle w:val="ListNumber"/>
-      </w:pPr>
-      <w:r>
-        <w:t>Provozovatel zpracovává osobní údaje zákazníka a účastníků zejména v rozsahu nezbytném pro vyřízení poptávky, uzavření a plnění smlouvy, organizaci akce, komunikaci, fakturaci, ochranu právních nároků a plnění zákonných povinností.</w:t>
-      </w:r>
-    </w:p>
-    <w:p>
-      <w:pPr>
-        <w:pStyle w:val="ListNumber"/>
-      </w:pPr>
-      <w:r>
-        <w:t>Zpracovávané údaje mohou zahrnovat jméno, příjmení, kontakty, fakturační údaje, věk účastníků, údaje o zdravotních omezeních nezbytné pro bezpečný průběh akce, kontakty pro případ nouze a údaje uvedené v objednávce.</w:t>
-      </w:r>
-    </w:p>
-    <w:p>
-      <w:pPr>
-        <w:pStyle w:val="ListNumber"/>
-      </w:pPr>
-      <w:r>
-        <w:t>Údaje o zdravotním stavu a zvláštních potřebách jsou požadovány pouze v rozsahu nezbytném pro bezpečný průběh akce. Zákazník je povinen je sdělit pravdivě, pokud mohou mít vliv na účast.</w:t>
-      </w:r>
-    </w:p>
-    <w:p>
-      <w:pPr>
-        <w:pStyle w:val="ListNumber"/>
-      </w:pPr>
-      <w:r>
-        <w:t>Podrobné informace o zpracování osobních údajů budou uvedeny v samostatném informačním dokumentu nebo na webu provozovatele.</w:t>
-      </w:r>
-    </w:p>
-    <w:p>
-      <w:pPr>
-        <w:pStyle w:val="Heading1"/>
-      </w:pPr>
-      <w:r>
-        <w:t>15. Reklamace a řešení stížností</w:t>
-      </w:r>
-    </w:p>
-    <w:p>
-      <w:pPr>
-        <w:pStyle w:val="ListNumber"/>
-      </w:pPr>
-      <w:r>
-        <w:t>Zákazník je povinen vytknout zjevné vady služby bez zbytečného odkladu, ideálně přímo na místě instruktorovi nebo kontaktní osobě provozovatele, aby bylo možné sjednat nápravu.</w:t>
-      </w:r>
-    </w:p>
-    <w:p>
-      <w:pPr>
-        <w:pStyle w:val="ListNumber"/>
-      </w:pPr>
-      <w:r>
-        <w:t>Reklamaci lze uplatnit e-mailem na kontaktní e-mail provozovatele. Reklamace musí obsahovat popis vady, datum akce, identifikaci zákazníka a požadovaný způsob řešení.</w:t>
-      </w:r>
-    </w:p>
-    <w:p>
-      <w:pPr>
-        <w:pStyle w:val="ListNumber"/>
-      </w:pPr>
-      <w:r>
-        <w:t>Provozovatel vyřídí reklamaci v přiměřené lhůtě. U spotřebitelů se postupuje podle příslušných právních předpisů.</w:t>
-      </w:r>
-    </w:p>
-    <w:p>
-      <w:pPr>
-        <w:pStyle w:val="ListNumber"/>
-      </w:pPr>
-      <w:r>
-        <w:t>Je-li zákazník spotřebitelem, může se v případě sporu obrátit také na Českou obchodní inspekci jako subjekt mimosoudního řešení spotřebitelských sporů.</w:t>
-      </w:r>
-    </w:p>
-    <w:p>
-      <w:pPr>
-        <w:pStyle w:val="Heading1"/>
-      </w:pPr>
-      <w:r>
-        <w:t>16. Závěrečná ustanovení</w:t>
-      </w:r>
-    </w:p>
-    <w:p>
-      <w:pPr>
-        <w:pStyle w:val="ListNumber"/>
-      </w:pPr>
-      <w:r>
-        <w:t>Tyto podmínky se řídí právem České republiky.</w:t>
-      </w:r>
-    </w:p>
-    <w:p>
-      <w:pPr>
-        <w:pStyle w:val="ListNumber"/>
-      </w:pPr>
-      <w:r>
-        <w:t>Pokud je některé ustanovení neplatné nebo neúčinné, nemá to vliv na platnost ostatních ustanovení. Strany jej nahradí ustanovením, které se co nejvíce blíží původnímu smyslu a je v souladu s právními předpisy.</w:t>
-      </w:r>
-    </w:p>
-    <w:p>
-      <w:pPr>
-        <w:pStyle w:val="ListNumber"/>
-      </w:pPr>
-      <w:r>
-        <w:t>Provozovatel může podmínky měnit. Pro konkrétní objednávku platí verze účinná v okamžiku uzavření smlouvy, pokud se strany nedohodnou jinak.</w:t>
-      </w:r>
-    </w:p>
-    <w:p>
-      <w:pPr>
-        <w:pStyle w:val="ListNumber"/>
-      </w:pPr>
-      <w:r>
-        <w:t>Nedílnou součástí procesu objednávky mají být zejména: potvrzení VOP, potvrzení rizik a bezpečnostních pravidel, souhlas zákonného zástupce u nezletilých, případně samostatný souhlas s fotografiemi a videem.</w:t>
+        <w:t>Tyto v?eobecn? obchodn? podm?nky se ??d? pr?vem ?esk? republiky. Pro konkr?tn? objedn?vku plat? zn?n? ??inn? ke dni uzav?en? smlouvy, pokud se strany nedohodnou jinak.</w:t>
       </w:r>
     </w:p>
     <w:sectPr>
-      <w:footerReference w:type="default" r:id="rId9"/>
       <w:pgSz w:w="12240" w:h="15840"/>
-      <w:pgMar w:top="1020" w:right="1134" w:bottom="907" w:left="1134" w:header="720" w:footer="720" w:gutter="0"/>
+      <w:pgMar w:top="1152" w:right="1152" w:bottom="1080" w:left="1152" w:header="720" w:footer="720" w:gutter="0"/>
       <w:cols w:space="720"/>
       <w:docGrid w:linePitch="360"/>
     </w:sectPr>
   </w:body>
 </w:document>
-</file>
-
-<file path=word/footer1.xml><?xml version="1.0" encoding="utf-8"?>
-<w:ftr xmlns:m="http://schemas.openxmlformats.org/officeDocument/2006/math" xmlns:mc="http://schemas.openxmlformats.org/markup-compatibility/2006" xmlns:mo="http://schemas.microsoft.com/office/mac/office/2008/main" xmlns:mv="urn:schemas-microsoft-com:mac:vml" xmlns:o="urn:schemas-microsoft-com:office:office" xmlns:r="http://schemas.openxmlformats.org/officeDocument/2006/relationships" xmlns:v="urn:schemas-microsoft-com:vml" xmlns:w10="urn:schemas-microsoft-com:office:word" xmlns:w14="http://schemas.microsoft.com/office/word/2010/wordml" xmlns:w="http://schemas.openxmlformats.org/wordprocessingml/2006/main" xmlns:wne="http://schemas.microsoft.com/office/word/2006/wordml" xmlns:wp14="http://schemas.microsoft.com/office/word/2010/wordprocessingDrawing" xmlns:wp="http://schemas.openxmlformats.org/drawingml/2006/wordprocessingDrawing" xmlns:wpc="http://schemas.microsoft.com/office/word/2010/wordprocessingCanvas" xmlns:wpg="http://schemas.microsoft.com/office/word/2010/wordprocessingGroup" xmlns:wpi="http://schemas.microsoft.com/office/word/2010/wordprocessingInk" xmlns:wps="http://schemas.microsoft.com/office/word/2010/wordprocessingShape" mc:Ignorable="w14 wp14">
-  <w:p>
-    <w:pPr>
-      <w:pStyle w:val="Footer"/>
-      <w:jc w:val="center"/>
-    </w:pPr>
-    <w:r>
-      <w:t xml:space="preserve">Eventy Jinak / IronBros s.r.o. | strana </w:t>
-      <w:fldChar w:fldCharType="begin"/>
-      <w:instrText xml:space="preserve">PAGE</w:instrText>
-      <w:fldChar w:fldCharType="end"/>
-    </w:r>
-  </w:p>
-</w:ftr>
 </file>
 
 <file path=word/numbering.xml><?xml version="1.0" encoding="utf-8"?>
@@ -1303,8 +720,12 @@
     <w:name w:val="Normal"/>
     <w:qFormat/>
     <w:rsid w:val="00FC693F"/>
+    <w:pPr>
+      <w:spacing w:after="120" w:line="276" w:lineRule="auto"/>
+    </w:pPr>
     <w:rPr>
-      <w:rFonts w:ascii="Arial" w:hAnsi="Arial" w:eastAsia="Arial"/>
+      <w:rFonts w:ascii="Arial" w:hAnsi="Arial"/>
+      <w:color w:val="1C201C"/>
       <w:sz w:val="21"/>
     </w:rPr>
   </w:style>
@@ -1367,11 +788,11 @@
       <w:outlineLvl w:val="0"/>
     </w:pPr>
     <w:rPr>
-      <w:rFonts w:asciiTheme="majorHAnsi" w:eastAsiaTheme="majorEastAsia" w:hAnsiTheme="majorHAnsi" w:cstheme="majorBidi" w:ascii="Arial" w:hAnsi="Arial" w:eastAsia="Arial"/>
+      <w:rFonts w:asciiTheme="majorHAnsi" w:eastAsiaTheme="majorEastAsia" w:hAnsiTheme="majorHAnsi" w:cstheme="majorBidi" w:ascii="Arial" w:hAnsi="Arial"/>
       <w:b/>
       <w:bCs/>
-      <w:color w:val="125336"/>
-      <w:sz w:val="30"/>
+      <w:color w:val="1C201C"/>
+      <w:sz w:val="31"/>
       <w:szCs w:val="28"/>
     </w:rPr>
   </w:style>
@@ -1391,10 +812,10 @@
       <w:outlineLvl w:val="1"/>
     </w:pPr>
     <w:rPr>
-      <w:rFonts w:asciiTheme="majorHAnsi" w:eastAsiaTheme="majorEastAsia" w:hAnsiTheme="majorHAnsi" w:cstheme="majorBidi" w:ascii="Arial" w:hAnsi="Arial" w:eastAsia="Arial"/>
+      <w:rFonts w:asciiTheme="majorHAnsi" w:eastAsiaTheme="majorEastAsia" w:hAnsiTheme="majorHAnsi" w:cstheme="majorBidi" w:ascii="Arial" w:hAnsi="Arial"/>
       <w:b/>
       <w:bCs/>
-      <w:color w:val="202528"/>
+      <w:color w:val="267A3F"/>
       <w:sz w:val="25"/>
       <w:szCs w:val="26"/>
     </w:rPr>
@@ -1415,11 +836,10 @@
       <w:outlineLvl w:val="2"/>
     </w:pPr>
     <w:rPr>
-      <w:rFonts w:asciiTheme="majorHAnsi" w:eastAsiaTheme="majorEastAsia" w:hAnsiTheme="majorHAnsi" w:cstheme="majorBidi" w:ascii="Arial" w:hAnsi="Arial" w:eastAsia="Arial"/>
+      <w:rFonts w:asciiTheme="majorHAnsi" w:eastAsiaTheme="majorEastAsia" w:hAnsiTheme="majorHAnsi" w:cstheme="majorBidi"/>
       <w:b/>
       <w:bCs/>
       <w:color w:val="4F81BD" w:themeColor="accent1"/>
-      <w:sz w:val="22"/>
     </w:rPr>
   </w:style>
   <w:style w:type="paragraph" w:styleId="Heading4">
@@ -1657,9 +1077,9 @@
       <w:contextualSpacing/>
     </w:pPr>
     <w:rPr>
-      <w:rFonts w:asciiTheme="majorHAnsi" w:eastAsiaTheme="majorEastAsia" w:hAnsiTheme="majorHAnsi" w:cstheme="majorBidi" w:ascii="Arial" w:hAnsi="Arial" w:eastAsia="Arial"/>
+      <w:rFonts w:asciiTheme="majorHAnsi" w:eastAsiaTheme="majorEastAsia" w:hAnsiTheme="majorHAnsi" w:cstheme="majorBidi" w:ascii="Arial" w:hAnsi="Arial"/>
       <w:b/>
-      <w:color w:val="125336"/>
+      <w:color w:val="1C201C"/>
       <w:spacing w:val="5"/>
       <w:kern w:val="28"/>
       <w:sz w:val="44"/>
@@ -12991,14 +12411,6 @@
         <w:shd w:val="clear" w:color="auto" w:fill="FBCAA2" w:themeFill="accent6" w:themeFillTint="7F"/>
       </w:tcPr>
     </w:tblStylePr>
-  </w:style>
-  <w:style w:type="paragraph" w:customStyle="1" w:styleId="SmallNote">
-    <w:name w:val="Small Note"/>
-    <w:rPr>
-      <w:rFonts w:ascii="Arial" w:hAnsi="Arial" w:eastAsia="Arial"/>
-      <w:color w:val="5A5A5A"/>
-      <w:sz w:val="18"/>
-    </w:rPr>
   </w:style>
 </w:styles>
 </file>

</xml_diff>

<commit_message>
Strengthen contract formation and liability wording
</commit_message>
<xml_diff>
--- a/assets/docs/vop-eventy-jinak.docx
+++ b/assets/docs/vop-eventy-jinak.docx
@@ -8,6 +8,7 @@
       </w:pPr>
       <w:r>
         <w:rPr>
+          <w:rFonts w:ascii="Arial" w:hAnsi="Arial"/>
           <w:b/>
           <w:color w:val="267A3F"/>
           <w:sz w:val="24"/>
@@ -21,6 +22,9 @@
         <w:jc w:val="center"/>
       </w:pPr>
       <w:r>
+        <w:rPr>
+          <w:rFonts w:ascii="Arial" w:hAnsi="Arial"/>
+        </w:rPr>
         <w:t>V?eobecn? obchodn? podm?nky</w:t>
       </w:r>
     </w:p>
@@ -30,6 +34,7 @@
       </w:pPr>
       <w:r>
         <w:rPr>
+          <w:rFonts w:ascii="Arial" w:hAnsi="Arial"/>
           <w:i/>
           <w:color w:val="586258"/>
           <w:sz w:val="21"/>
@@ -43,16 +48,27 @@
         <w:pStyle w:val="Heading1"/>
       </w:pPr>
       <w:r>
+        <w:rPr>
+          <w:rFonts w:ascii="Arial" w:hAnsi="Arial"/>
+        </w:rPr>
         <w:t>1. Provozovatel a p?sobnost podm?nek</w:t>
       </w:r>
     </w:p>
     <w:p>
       <w:r>
+        <w:rPr>
+          <w:rFonts w:ascii="Arial" w:hAnsi="Arial"/>
+          <w:b w:val="0"/>
+        </w:rPr>
         <w:t>Provozovatelem slu?eb pod zna?kou Eventy Jinak je spole?nost IronBros s.r.o., se s?dlem ?.ev. 402, 267 11 Vr??, I?O 238 94 474, zapsan? pod sp. zn. C 434687 u M?stsk?ho soudu v Praze, kontaktn? e-mail info@eventyjinak.cz.</w:t>
       </w:r>
     </w:p>
     <w:p>
       <w:r>
+        <w:rPr>
+          <w:rFonts w:ascii="Arial" w:hAnsi="Arial"/>
+          <w:b w:val="0"/>
+        </w:rPr>
         <w:t>Tyto v?eobecn? obchodn? podm?nky se vztahuj? na objedn?n? a poskytov?n? z??itkov?ch, lezeck?ch, outdoorov?ch, v?kendov?ch a v?cedenn?ch program?, teambuilding?, oslav a souvisej?c?ch slu?eb.</w:t>
       </w:r>
     </w:p>
@@ -61,22 +77,46 @@
         <w:pStyle w:val="Heading1"/>
       </w:pPr>
       <w:r>
+        <w:rPr>
+          <w:rFonts w:ascii="Arial" w:hAnsi="Arial"/>
+        </w:rPr>
         <w:t>2. Popt?vka, nab?dka a vznik smlouvy</w:t>
       </w:r>
     </w:p>
     <w:p>
       <w:r>
+        <w:rPr>
+          <w:rFonts w:ascii="Arial" w:hAnsi="Arial"/>
+          <w:b w:val="0"/>
+        </w:rPr>
         <w:t>Odesl?n?m formul??e na webu nebo zasl?n?m e-mailu vznik? nez?vazn? popt?vka, nikoliv automaticky smlouva. Na z?klad? popt?vky p?iprav?me individu?ln? n?vrh akce, kter? obvykle obsahuje druh programu, term?n, lokalitu, po?et ??astn?k?, rozsah slu?eb, cenu, platebn? podm?nky, n?vrh smlouvy a p??padn? z?lohovou fakturu.</w:t>
       </w:r>
     </w:p>
     <w:p>
       <w:r>
+        <w:rPr>
+          <w:rFonts w:ascii="Arial" w:hAnsi="Arial"/>
+          <w:b w:val="0"/>
+        </w:rPr>
         <w:t>Z?vazn? objedn?vka a uzav?en? smlouvy vznikaj? a? okam?ikem p?ips?n? dohodnut? z?lohov? platby na ??et provozovatele, pokud byl z?kazn?kovi p?edem doru?en n?vrh smlouvy, tyto VOP a z?lohov? faktura.</w:t>
       </w:r>
     </w:p>
     <w:p>
       <w:r>
-        <w:t>Uhrazen?m z?lohy z?kazn?k potvrzuje, ?e se se smlouvou a VOP sezn?mil a souhlas? s nimi.</w:t>
+        <w:rPr>
+          <w:rFonts w:ascii="Arial" w:hAnsi="Arial"/>
+          <w:b w:val="0"/>
+        </w:rPr>
+        <w:t>Uhrazen?m z?lohy z?kazn?k potvrzuje, ?e se se smlouvou, VOP a dal??mi p?ilo?en?mi dokumenty sezn?mil a souhlas? s nimi.</w:t>
+      </w:r>
+    </w:p>
+    <w:p>
+      <w:r>
+        <w:rPr>
+          <w:rFonts w:ascii="Arial" w:hAnsi="Arial"/>
+          <w:b w:val="0"/>
+        </w:rPr>
+        <w:t>Variabiln? symbol uveden? na z?lohov? faktu?e slou?? jako identifik?tor konkr?tn? akce, n?vrhu smlouvy a souvisej?c?ho smluvn?ho bal??ku. P?ips?n? platby pod t?mto variabiln?m symbolem se pova?uje za jednozna?n? potvrzen? p??slu?n? smlouvy.</w:t>
       </w:r>
     </w:p>
     <w:p>
@@ -84,17 +124,37 @@
         <w:pStyle w:val="Heading1"/>
       </w:pPr>
       <w:r>
+        <w:rPr>
+          <w:rFonts w:ascii="Arial" w:hAnsi="Arial"/>
+        </w:rPr>
         <w:t>3. Cena a platebn? podm?nky</w:t>
       </w:r>
     </w:p>
     <w:p>
       <w:r>
+        <w:rPr>
+          <w:rFonts w:ascii="Arial" w:hAnsi="Arial"/>
+          <w:b w:val="0"/>
+        </w:rPr>
         <w:t>Cena je stanovena individu?ln? podle po?tu ??astn?k?, rozsahu programu, lokality, n?rok? na instruktory, dopravu, vybaven?, ubytov?n?, stravu, fotodokumentaci a dal??ch sjednan?ch slu?eb.</w:t>
       </w:r>
     </w:p>
     <w:p>
       <w:r>
+        <w:rPr>
+          <w:rFonts w:ascii="Arial" w:hAnsi="Arial"/>
+          <w:b w:val="0"/>
+        </w:rPr>
         <w:t>Pokud nen? dohodnuto jinak, po?adujeme p?ed realizac? akce z?lohu, zpravidla ve v??i 50 % z celkov? ceny. Term?n akce pova?ujeme za z?vazn? rezervovan? a? po p?ips?n? z?lohy. Doplatek ceny je splatn? podle individu?ln? nab?dky, smlouvy nebo vystaven? faktury.</w:t>
+      </w:r>
+    </w:p>
+    <w:p>
+      <w:r>
+        <w:rPr>
+          <w:rFonts w:ascii="Arial" w:hAnsi="Arial"/>
+          <w:b w:val="0"/>
+        </w:rPr>
+        <w:t>Z?lohov? faktura m??e b?t zasl?na spole?n? s n?vrhem smlouvy, t?mito VOP, informac? o zpracov?n? osobn?ch ?daj?, bezpe?nostn?mi pravidly a p??padn? dal??mi p??lohami vztahuj?c?mi se ke konkr?tn? akci.</w:t>
       </w:r>
     </w:p>
     <w:p>
@@ -102,16 +162,27 @@
         <w:pStyle w:val="Heading1"/>
       </w:pPr>
       <w:r>
+        <w:rPr>
+          <w:rFonts w:ascii="Arial" w:hAnsi="Arial"/>
+        </w:rPr>
         <w:t>4. Zm?na programu, po?as? a bezpe?nost</w:t>
       </w:r>
     </w:p>
     <w:p>
       <w:r>
+        <w:rPr>
+          <w:rFonts w:ascii="Arial" w:hAnsi="Arial"/>
+          <w:b w:val="0"/>
+        </w:rPr>
         <w:t>Outdoorov? a lezeck? akce jsou z?visl? na po?as?, stavu ter?nu, pravidlech dan? lokality, ochran? p??rody a aktu?ln? bezpe?nostn? situaci. Z t?chto d?vod? jsme opr?vn?ni p?im??en? zm?nit lokalitu, trasu, ?asov? harmonogram nebo obsah programu.</w:t>
       </w:r>
     </w:p>
     <w:p>
       <w:r>
+        <w:rPr>
+          <w:rFonts w:ascii="Arial" w:hAnsi="Arial"/>
+          <w:b w:val="0"/>
+        </w:rPr>
         <w:t>Pokud nen? mo?n? akci bezpe?n? realizovat, budeme p?ednostn? hledat n?hradn? term?n nebo bezpe?nou alternativu programu.</w:t>
       </w:r>
     </w:p>
@@ -120,11 +191,18 @@
         <w:pStyle w:val="Heading1"/>
       </w:pPr>
       <w:r>
+        <w:rPr>
+          <w:rFonts w:ascii="Arial" w:hAnsi="Arial"/>
+        </w:rPr>
         <w:t>5. Storno a zm?na term?nu</w:t>
       </w:r>
     </w:p>
     <w:p>
       <w:r>
+        <w:rPr>
+          <w:rFonts w:ascii="Arial" w:hAnsi="Arial"/>
+          <w:b w:val="0"/>
+        </w:rPr>
         <w:t>Po uzav?en? smlouvy a uhrazen? z?lohy se p??padn? zru?en? akce nebo odstoupen? z?kazn?ka ??d? t?mito storno podm?nkami, pokud nen? v individu?ln? nab?dce nebo smlouv? sjedn?no jinak:</w:t>
       </w:r>
     </w:p>
@@ -134,6 +212,9 @@
         <w:spacing w:after="40"/>
       </w:pPr>
       <w:r>
+        <w:rPr>
+          <w:rFonts w:ascii="Arial" w:hAnsi="Arial"/>
+        </w:rPr>
         <w:t>v?ce ne? 30 dn? p?ed akc?: do 20 % ceny,</w:t>
       </w:r>
     </w:p>
@@ -143,6 +224,9 @@
         <w:spacing w:after="40"/>
       </w:pPr>
       <w:r>
+        <w:rPr>
+          <w:rFonts w:ascii="Arial" w:hAnsi="Arial"/>
+        </w:rPr>
         <w:t>15 a? 30 dn? p?ed akc?: do 50 % ceny,</w:t>
       </w:r>
     </w:p>
@@ -152,6 +236,9 @@
         <w:spacing w:after="40"/>
       </w:pPr>
       <w:r>
+        <w:rPr>
+          <w:rFonts w:ascii="Arial" w:hAnsi="Arial"/>
+        </w:rPr>
         <w:t>7 a? 14 dn? p?ed akc?: do 75 % ceny,</w:t>
       </w:r>
     </w:p>
@@ -161,6 +248,9 @@
         <w:spacing w:after="40"/>
       </w:pPr>
       <w:r>
+        <w:rPr>
+          <w:rFonts w:ascii="Arial" w:hAnsi="Arial"/>
+        </w:rPr>
         <w:t>m?n? ne? 7 dn? p?ed akc?: do 100 % ceny.</w:t>
       </w:r>
     </w:p>
@@ -170,6 +260,9 @@
         <w:spacing w:after="40"/>
       </w:pPr>
       <w:r>
+        <w:rPr>
+          <w:rFonts w:ascii="Arial" w:hAnsi="Arial"/>
+        </w:rPr>
         <w:t>Konkr?tn? v??e storna se v?dy posuzuje i podle ji? vznikl?ch a nevratn?ch n?klad?, zejm?na u dopravy, ubytov?n?, pr?ce instruktor? nebo dal??ch slu?eb t?et?ch osob.</w:t>
       </w:r>
     </w:p>
@@ -179,6 +272,9 @@
         <w:spacing w:after="40"/>
       </w:pPr>
       <w:r>
+        <w:rPr>
+          <w:rFonts w:ascii="Arial" w:hAnsi="Arial"/>
+        </w:rPr>
         <w:t>Uhrazen?m z?lohy z?kazn?k bere na v?dom?, ?e po vzniku z?vazn? objedn?vky se p??padn? ukon?en? vztahu ??d? storno podm?nkami, nikoliv pouh?m bezplatn?m zru?en?m rezervace.</w:t>
       </w:r>
     </w:p>
@@ -187,21 +283,36 @@
         <w:pStyle w:val="Heading1"/>
       </w:pPr>
       <w:r>
+        <w:rPr>
+          <w:rFonts w:ascii="Arial" w:hAnsi="Arial"/>
+        </w:rPr>
         <w:t>6. Spot?ebitel a odstoupen? od smlouvy</w:t>
       </w:r>
     </w:p>
     <w:p>
       <w:r>
+        <w:rPr>
+          <w:rFonts w:ascii="Arial" w:hAnsi="Arial"/>
+          <w:b w:val="0"/>
+        </w:rPr>
         <w:t>Je-li z?kazn?kem spot?ebitel a smlouva je uzav?ena distan?n?, uplatn? se p??slu?n? pravidla ochrany spot?ebitele.</w:t>
       </w:r>
     </w:p>
     <w:p>
       <w:r>
+        <w:rPr>
+          <w:rFonts w:ascii="Arial" w:hAnsi="Arial"/>
+          <w:b w:val="0"/>
+        </w:rPr>
         <w:t>U slu?eb souvisej?c?ch s volno?asov?mi aktivitami poskytovan?mi v konkr?tn?m term?nu nebo obdob? m??e b?t pr?vo odstoupit od smlouvy bez ud?n? d?vodu vylou?eno v rozsahu stanoven?m pr?vn?mi p?edpisy.</w:t>
       </w:r>
     </w:p>
     <w:p>
       <w:r>
+        <w:rPr>
+          <w:rFonts w:ascii="Arial" w:hAnsi="Arial"/>
+          <w:b w:val="0"/>
+        </w:rPr>
         <w:t>Web Eventy Jinak slou?? p?edev??m pro nez?vazn? popt?vky. Samotn? smlouva a z?vazn? rezervace term?nu vznikaj? a? po doru?en? n?vrhu smlouvy a p?ips?n? z?lohov? platby.</w:t>
       </w:r>
     </w:p>
@@ -210,11 +321,18 @@
         <w:pStyle w:val="Heading1"/>
       </w:pPr>
       <w:r>
+        <w:rPr>
+          <w:rFonts w:ascii="Arial" w:hAnsi="Arial"/>
+        </w:rPr>
         <w:t>7. Povinnosti z?kazn?ka a ??astn?k?</w:t>
       </w:r>
     </w:p>
     <w:p>
       <w:r>
+        <w:rPr>
+          <w:rFonts w:ascii="Arial" w:hAnsi="Arial"/>
+          <w:b w:val="0"/>
+        </w:rPr>
         <w:t>uv?st pravdiv? informace o po?tu ??astn?k?, v?ku, zku?enostech a zdravotn?ch omezen?ch,</w:t>
       </w:r>
     </w:p>
@@ -224,6 +342,9 @@
         <w:spacing w:after="40"/>
       </w:pPr>
       <w:r>
+        <w:rPr>
+          <w:rFonts w:ascii="Arial" w:hAnsi="Arial"/>
+        </w:rPr>
         <w:t>zajistit, aby byli ??astn?ci sezn?meni s charakterem programu a bezpe?nostn?mi pravidly,</w:t>
       </w:r>
     </w:p>
@@ -233,6 +354,9 @@
         <w:spacing w:after="40"/>
       </w:pPr>
       <w:r>
+        <w:rPr>
+          <w:rFonts w:ascii="Arial" w:hAnsi="Arial"/>
+        </w:rPr>
         <w:t>dodr?ovat pokyny instruktora, pr?vodce nebo jin? pov??en? osoby,</w:t>
       </w:r>
     </w:p>
@@ -242,6 +366,9 @@
         <w:spacing w:after="40"/>
       </w:pPr>
       <w:r>
+        <w:rPr>
+          <w:rFonts w:ascii="Arial" w:hAnsi="Arial"/>
+        </w:rPr>
         <w:t>ne??astnit se programu pod vlivem alkoholu nebo jin?ch n?vykov?ch l?tek,</w:t>
       </w:r>
     </w:p>
@@ -251,7 +378,22 @@
         <w:spacing w:after="40"/>
       </w:pPr>
       <w:r>
-        <w:t>m?t vhodn? oble?en?, obuv a vybaven? odpov?daj?c? pokyn?m organiz?tora.</w:t>
+        <w:rPr>
+          <w:rFonts w:ascii="Arial" w:hAnsi="Arial"/>
+        </w:rPr>
+        <w:t>m?t vhodn? oble?en?, obuv a vybaven? odpov?daj?c? pokyn?m organiz?tora,</w:t>
+      </w:r>
+    </w:p>
+    <w:p>
+      <w:pPr>
+        <w:pStyle w:val="ListBullet"/>
+        <w:spacing w:after="40"/>
+      </w:pPr>
+      <w:r>
+        <w:rPr>
+          <w:rFonts w:ascii="Arial" w:hAnsi="Arial"/>
+        </w:rPr>
+        <w:t>dodr?ovat pr?vn? p?edpisy, n?v?t?vn? ??dy lokalit a bezpe?nostn? pravidla stanoven? po?adatelem.</w:t>
       </w:r>
     </w:p>
     <w:p>
@@ -259,16 +401,27 @@
         <w:pStyle w:val="Heading1"/>
       </w:pPr>
       <w:r>
+        <w:rPr>
+          <w:rFonts w:ascii="Arial" w:hAnsi="Arial"/>
+        </w:rPr>
         <w:t>8. Rizikovost programu</w:t>
       </w:r>
     </w:p>
     <w:p>
       <w:r>
+        <w:rPr>
+          <w:rFonts w:ascii="Arial" w:hAnsi="Arial"/>
+          <w:b w:val="0"/>
+        </w:rPr>
         <w:t>Z?kazn?k i ??astn?ci berou na v?dom?, ?e lezen? ve skal?ch, pohyb v p??rod?, sla?ov?n?, v?cedenn? programy a dal?? outdoorov? aktivity jsou spojeny s p?irozen?m rizikem, kter? nelze zcela odstranit ani p?i odborn?m veden? a pou?it? bezpe?nostn?ho vybaven?.</w:t>
       </w:r>
     </w:p>
     <w:p>
       <w:r>
+        <w:rPr>
+          <w:rFonts w:ascii="Arial" w:hAnsi="Arial"/>
+          <w:b w:val="0"/>
+        </w:rPr>
         <w:t>Program p?izp?sobujeme zku?enostem skupiny, ale ??astn?ci jsou povinni aktivn? spolupracovat a bez odkladu hl?sit zdravotn? omezen?, ?navu nebo jin? okolnosti podstatn? pro bezpe?nost.</w:t>
       </w:r>
     </w:p>
@@ -277,11 +430,18 @@
         <w:pStyle w:val="Heading1"/>
       </w:pPr>
       <w:r>
+        <w:rPr>
+          <w:rFonts w:ascii="Arial" w:hAnsi="Arial"/>
+        </w:rPr>
         <w:t>9. Nezletil? ??astn?ci</w:t>
       </w:r>
     </w:p>
     <w:p>
       <w:r>
+        <w:rPr>
+          <w:rFonts w:ascii="Arial" w:hAnsi="Arial"/>
+          <w:b w:val="0"/>
+        </w:rPr>
         <w:t>??ast nezletil?ch je mo?n? pouze se souhlasem z?konn?ho z?stupce. Z?kazn?k je povinen p?edat v?echny podstatn? informace o d?t?ti, zejm?na v?k, zdravotn? omezen?, alergie, kontakty pro p??pad nouze a osobu odpov?dnou za p?ed?n? a p?evzet? d?t?te.</w:t>
       </w:r>
     </w:p>
@@ -290,12 +450,37 @@
         <w:pStyle w:val="Heading1"/>
       </w:pPr>
       <w:r>
+        <w:rPr>
+          <w:rFonts w:ascii="Arial" w:hAnsi="Arial"/>
+        </w:rPr>
         <w:t>10. Extern? instrukto?i a dal?? dodavatel?</w:t>
       </w:r>
     </w:p>
     <w:p>
       <w:r>
-        <w:t>Akce mohou b?t zaji??ov?ny tak? prost?ednictv?m extern?ch instruktor?, pr?vodc?, fotograf?, dopravc?, ubytovac?ch za??zen? a dal??ch spolupracuj?c?ch osob. ??astn?ci jsou povinni ??dit se jejich pokyny v rozsahu, v jak?m jsou pov??eni organizac? a bezpe?n?m veden?m akce.</w:t>
+        <w:rPr>
+          <w:rFonts w:ascii="Arial" w:hAnsi="Arial"/>
+          <w:b w:val="0"/>
+        </w:rPr>
+        <w:t>Akce mohou b?t zaji??ov?ny tak? prost?ednictv?m extern?ch instruktor?, pr?vodc?, fotograf?, dopravc?, ubytovac?ch za??zen? a dal??ch spolupracuj?c?ch osob.</w:t>
+      </w:r>
+    </w:p>
+    <w:p>
+      <w:r>
+        <w:rPr>
+          <w:rFonts w:ascii="Arial" w:hAnsi="Arial"/>
+          <w:b w:val="0"/>
+        </w:rPr>
+        <w:t>??astn?ci jsou povinni ??dit se jejich pokyny v rozsahu, v jak?m jsou pov??eni organizac? a bezpe?n?m veden?m akce.</w:t>
+      </w:r>
+    </w:p>
+    <w:p>
+      <w:r>
+        <w:rPr>
+          <w:rFonts w:ascii="Arial" w:hAnsi="Arial"/>
+          <w:b w:val="0"/>
+        </w:rPr>
+        <w:t>Provozovatel odpov?d? za v?b?r, zad?n? a organiza?n? koordinaci smluvn?ch vykonavatel? v rozsahu sjednan? slu?by, nikoliv v?ak za samostatn? poru?en? povinnost? t?chto osob, kter? nemohl ani p?i vynalo?en? odborn? p??e rozumn? p?edv?dat nebo odvr?tit.</w:t>
       </w:r>
     </w:p>
     <w:p>
@@ -303,17 +488,46 @@
         <w:pStyle w:val="Heading1"/>
       </w:pPr>
       <w:r>
+        <w:rPr>
+          <w:rFonts w:ascii="Arial" w:hAnsi="Arial"/>
+        </w:rPr>
         <w:t>11. Odpov?dnost a poji?t?n?</w:t>
       </w:r>
     </w:p>
     <w:p>
       <w:r>
-        <w:t>Odpov?d?me za ??dn? poskytnut? sjednan? slu?by v rozsahu podle pr?vn?ch p?edpis? a individu?ln? nab?dky. Neodpov?d?me v?ak za ?kodu nebo ?jmu zp?sobenou zejm?na poru?en?m pokyn?, zatajen?m d?le?it?ch informac?, nevhodn?m vybaven?m, jedn?n?m ??astn?ka, jedn?n?m t?et?ch osob nebo vy??? moc?.</w:t>
+        <w:rPr>
+          <w:rFonts w:ascii="Arial" w:hAnsi="Arial"/>
+          <w:b w:val="0"/>
+        </w:rPr>
+        <w:t>Provozovatel se zavazuje ??dn? a sv?domit? p?ipravit, zorganizovat a koordinovat sjednanou akci, p?edat pot?ebn? informace, p?ipravit program podle sjednan?ho rozsahu a stanovit bezpe?nostn? pravidla pro ??astn?ky i smluvn? vykonavatele akce.</w:t>
       </w:r>
     </w:p>
     <w:p>
       <w:r>
+        <w:rPr>
+          <w:rFonts w:ascii="Arial" w:hAnsi="Arial"/>
+          <w:b w:val="0"/>
+        </w:rPr>
+        <w:t>Provozovatel neodpov?d? za ?kodu nebo ?jmu zp?sobenou zejm?na poru?en?m pokyn?, zatajen?m d?le?it?ch informac?, nevhodn?m vybaven?m, jedn?n?m nebo opomenut?m z?kazn?ka ?i ??astn?ka, poru?en?m pr?vn?ch p?edpis?, n?v?t?vn?ch ??d? a pravidel lokality ze strany z?kazn?ka nebo ??astn?k?, ani za jedn?n? t?et?ch osob mimo kontrolu provozovatele nebo za vy??? moc.</w:t>
+      </w:r>
+    </w:p>
+    <w:p>
+      <w:r>
+        <w:rPr>
+          <w:rFonts w:ascii="Arial" w:hAnsi="Arial"/>
+          <w:b w:val="0"/>
+        </w:rPr>
         <w:t>Poji?t?n? provozovatele nen? automaticky ?razov?m poji?t?n?m ??astn?k?. U v?cedenn?ch a rizikov?j??ch program? doporu?ujeme vlastn? ?razov? nebo cestovn? poji?t?n?.</w:t>
+      </w:r>
+    </w:p>
+    <w:p>
+      <w:r>
+        <w:rPr>
+          <w:rFonts w:ascii="Arial" w:hAnsi="Arial"/>
+          <w:b w:val="0"/>
+        </w:rPr>
+        <w:t>T?m nen? dot?ena odpov?dnost provozovatele v rozsahu, v jak?m ji nelze podle pr?vn?ch p?edpis? p?edem vylou?it nebo omezit.</w:t>
       </w:r>
     </w:p>
     <w:p>
@@ -321,16 +535,27 @@
         <w:pStyle w:val="Heading1"/>
       </w:pPr>
       <w:r>
+        <w:rPr>
+          <w:rFonts w:ascii="Arial" w:hAnsi="Arial"/>
+        </w:rPr>
         <w:t>12. Reklamace a ?e?en? spor?</w:t>
       </w:r>
     </w:p>
     <w:p>
       <w:r>
+        <w:rPr>
+          <w:rFonts w:ascii="Arial" w:hAnsi="Arial"/>
+          <w:b w:val="0"/>
+        </w:rPr>
         <w:t>Vady slu?by je vhodn? vytknout bez zbyte?n?ho odkladu, ide?ln? ji? v pr?b?hu akce, aby bylo mo?n? situaci ?e?it na m?st?. P?semn? reklamace lze zaslat na info@eventyjinak.cz.</w:t>
       </w:r>
     </w:p>
     <w:p>
       <w:r>
+        <w:rPr>
+          <w:rFonts w:ascii="Arial" w:hAnsi="Arial"/>
+          <w:b w:val="0"/>
+        </w:rPr>
         <w:t>Spot?ebitel m? pr?vo obr?tit se se st??nost? tak? na subjekt mimosoudn?ho ?e?en? spot?ebitelsk?ch spor?. Podrobnosti uv?d?me v dokumentu Reklamace a ADR.</w:t>
       </w:r>
     </w:p>
@@ -339,17 +564,24 @@
         <w:pStyle w:val="Heading1"/>
       </w:pPr>
       <w:r>
+        <w:rPr>
+          <w:rFonts w:ascii="Arial" w:hAnsi="Arial"/>
+        </w:rPr>
         <w:t>13. Z?v?re?n? ustanoven?</w:t>
       </w:r>
     </w:p>
     <w:p>
       <w:r>
+        <w:rPr>
+          <w:rFonts w:ascii="Arial" w:hAnsi="Arial"/>
+          <w:b w:val="0"/>
+        </w:rPr>
         <w:t>Tyto v?eobecn? obchodn? podm?nky se ??d? pr?vem ?esk? republiky. Pro konkr?tn? objedn?vku plat? zn?n? ??inn? ke dni uzav?en? smlouvy, pokud se strany nedohodnou jinak.</w:t>
       </w:r>
     </w:p>
     <w:sectPr>
       <w:pgSz w:w="12240" w:h="15840"/>
-      <w:pgMar w:top="1152" w:right="1152" w:bottom="1080" w:left="1152" w:header="720" w:footer="720" w:gutter="0"/>
+      <w:pgMar w:top="1080" w:right="1152" w:bottom="1080" w:left="1152" w:header="720" w:footer="720" w:gutter="0"/>
       <w:cols w:space="720"/>
       <w:docGrid w:linePitch="360"/>
     </w:sectPr>

</xml_diff>